<commit_message>
v1.2: Appendix A mapped to California Ed Code 49073.1's nine required terms; parent-notification procedure, responsible individuals, joint FERPA compliance, non-retention certification, pupil-generated content
Co-Authored-By: Claude Fable 5.1 <noreply@anthropic.com>
</commit_message>
<xml_diff>
--- a/downloads/chss-district-commitments.docx
+++ b/downloads/chss-district-commitments.docx
@@ -15,7 +15,7 @@
         <w:rPr>
           <w:i/>
         </w:rPr>
-        <w:t>Draft v1.1 · Oct 27, 2026 · Center for High School Success · for discussion; not legal advice</w:t>
+        <w:t>Draft v1.2 · Oct 27, 2026 · Center for High School Success · for discussion; not legal advice</w:t>
       </w:r>
     </w:p>
     <w:p>
@@ -1493,7 +1493,7 @@
           <w:p>
             <w:r/>
             <w:r>
-              <w:t>Technical contact</w:t>
+              <w:t>District technical contact</w:t>
             </w:r>
           </w:p>
         </w:tc>
@@ -1517,7 +1517,7 @@
           <w:p>
             <w:r/>
             <w:r>
-              <w:t>Privacy contact</w:t>
+              <w:t>District privacy contact</w:t>
             </w:r>
           </w:p>
         </w:tc>
@@ -1541,7 +1541,7 @@
           <w:p>
             <w:r/>
             <w:r>
-              <w:t>Program contact(s)</w:t>
+              <w:t>District program contact(s)</w:t>
             </w:r>
           </w:p>
         </w:tc>
@@ -1553,6 +1553,54 @@
             <w:r/>
             <w:r>
               <w:t>[name, school]</w:t>
+            </w:r>
+          </w:p>
+        </w:tc>
+      </w:tr>
+      <w:tr>
+        <w:tc>
+          <w:tcPr>
+            <w:tcW w:type="dxa" w:w="4320"/>
+          </w:tcPr>
+          <w:p>
+            <w:r/>
+            <w:r>
+              <w:t>CHSS privacy officer (Appendix A.7)</w:t>
+            </w:r>
+          </w:p>
+        </w:tc>
+        <w:tc>
+          <w:tcPr>
+            <w:tcW w:type="dxa" w:w="4320"/>
+          </w:tcPr>
+          <w:p>
+            <w:r/>
+            <w:r>
+              <w:t>[name, title, email, phone]</w:t>
+            </w:r>
+          </w:p>
+        </w:tc>
+      </w:tr>
+      <w:tr>
+        <w:tc>
+          <w:tcPr>
+            <w:tcW w:type="dxa" w:w="4320"/>
+          </w:tcPr>
+          <w:p>
+            <w:r/>
+            <w:r>
+              <w:t>CHSS security officer (Appendix A.7)</w:t>
+            </w:r>
+          </w:p>
+        </w:tc>
+        <w:tc>
+          <w:tcPr>
+            <w:tcW w:type="dxa" w:w="4320"/>
+          </w:tcPr>
+          <w:p>
+            <w:r/>
+            <w:r>
+              <w:t>[name, title, email, phone]</w:t>
             </w:r>
           </w:p>
         </w:tc>

</xml_diff>

<commit_message>
v1.4: TEC 18-state NDPA readiness checklist, draft Exhibits A/B/I, three new gates (privacy plan, accessibility, framework), D-1 lists service-created and staff data, NDPA audit clause governs
Co-Authored-By: Claude Opus 5.5 <noreply@anthropic.com>
</commit_message>
<xml_diff>
--- a/downloads/chss-district-commitments.docx
+++ b/downloads/chss-district-commitments.docx
@@ -15,7 +15,7 @@
         <w:rPr>
           <w:i/>
         </w:rPr>
-        <w:t>Draft v1.3 · Oct 27, 2026 · Center for High School Success · for discussion; not legal advice</w:t>
+        <w:t>Draft v1.4 · Oct 29, 2026 · Center for High School Success · for discussion; not legal advice</w:t>
       </w:r>
     </w:p>
     <w:p>
@@ -1012,6 +1012,76 @@
           </w:tcPr>
           <w:p>
             <w:r/>
+          </w:p>
+        </w:tc>
+      </w:tr>
+      <w:tr>
+        <w:tc>
+          <w:tcPr>
+            <w:tcW w:type="dxa" w:w="2880"/>
+          </w:tcPr>
+          <w:p>
+            <w:r/>
+            <w:r>
+              <w:t>Data created in the Services: intervention plans and records, team meeting notes, on-track and risk flags, software-generated suggestions</w:t>
+            </w:r>
+          </w:p>
+        </w:tc>
+        <w:tc>
+          <w:tcPr>
+            <w:tcW w:type="dxa" w:w="2880"/>
+          </w:tcPr>
+          <w:p>
+            <w:r/>
+            <w:r>
+              <w:t>Created by School Team and CHSS users</w:t>
+            </w:r>
+          </w:p>
+        </w:tc>
+        <w:tc>
+          <w:tcPr>
+            <w:tcW w:type="dxa" w:w="2880"/>
+          </w:tcPr>
+          <w:p>
+            <w:r/>
+            <w:r>
+              <w:t>Student Data for all purposes of this Agreement and Appendix A</w:t>
+            </w:r>
+          </w:p>
+        </w:tc>
+      </w:tr>
+      <w:tr>
+        <w:tc>
+          <w:tcPr>
+            <w:tcW w:type="dxa" w:w="2880"/>
+          </w:tcPr>
+          <w:p>
+            <w:r/>
+            <w:r>
+              <w:t>Staff data: names, work email, role, school, Navigator username; teacher of record where provided</w:t>
+            </w:r>
+          </w:p>
+        </w:tc>
+        <w:tc>
+          <w:tcPr>
+            <w:tcW w:type="dxa" w:w="2880"/>
+          </w:tcPr>
+          <w:p>
+            <w:r/>
+            <w:r>
+              <w:t>Required for Navigator users</w:t>
+            </w:r>
+          </w:p>
+        </w:tc>
+        <w:tc>
+          <w:tcPr>
+            <w:tcW w:type="dxa" w:w="2880"/>
+          </w:tcPr>
+          <w:p>
+            <w:r/>
+            <w:r>
+              <w:t>Protected under Appendix A the same way as Student Data; listed as teacher data in NDPA Exhibit I where applicable</w:t>
+            </w:r>
           </w:p>
         </w:tc>
       </w:tr>

</xml_diff>